<commit_message>
feat(formatting): standardize all submissions to A4, L4/R3/T3/B3 margins, justified body
Apply Indonesian S2 academic formatting standard across 6 docx files:
Artikel 5, 6, 7, 8 and RMK Pert. 4, 5. Page size corrected from US
Letter to A4 (21x29.7 cm). Margins set to Left 4 cm / Right 3 cm /
Top 3 cm / Bottom 3 cm. Headings left-aligned; Normal and Body Text
paragraphs justified via direct XML (w:jc) override so Word style
inheritance cannot revert alignment.

Also adds Dev Assistant/scripts/fix_formatting.py as reusable tool.

Co-Authored-By: Claude Sonnet 4.6 <noreply@anthropic.com>
</commit_message>
<xml_diff>
--- a/Critical Thinking of the Article/01079_Dzaki Muhammad Yusfian_Artikel 5.docx
+++ b/Critical Thinking of the Article/01079_Dzaki Muhammad Yusfian_Artikel 5.docx
@@ -8,6 +8,7 @@
         <w:rPr>
           <w:rFonts w:ascii="Times New Roman" w:hAnsi="Times New Roman" w:cs="Times New Roman"/>
         </w:rPr>
+        <w:jc w:val="left"/>
       </w:pPr>
       <w:bookmarkStart w:id="0" w:name="critical-review-artikel-5"/>
       <w:r>
@@ -23,6 +24,7 @@
         <w:rPr>
           <w:rFonts w:cs="Times New Roman"/>
         </w:rPr>
+        <w:jc w:val="both"/>
       </w:pPr>
       <w:r>
         <w:rPr>
@@ -46,6 +48,7 @@
         <w:rPr>
           <w:rFonts w:cs="Times New Roman"/>
         </w:rPr>
+        <w:jc w:val="both"/>
       </w:pPr>
       <w:r>
         <w:rPr>
@@ -69,6 +72,7 @@
         <w:rPr>
           <w:rFonts w:cs="Times New Roman"/>
         </w:rPr>
+        <w:jc w:val="both"/>
       </w:pPr>
       <w:r>
         <w:rPr>
@@ -92,6 +96,7 @@
         <w:rPr>
           <w:rFonts w:cs="Times New Roman"/>
         </w:rPr>
+        <w:jc w:val="both"/>
       </w:pPr>
       <w:r>
         <w:rPr>
@@ -114,6 +119,7 @@
         <w:rPr>
           <w:rFonts w:cs="Times New Roman"/>
         </w:rPr>
+        <w:jc w:val="both"/>
       </w:pPr>
       <w:r>
         <w:rPr>
@@ -130,6 +136,7 @@
         <w:rPr>
           <w:rFonts w:ascii="Times New Roman" w:hAnsi="Times New Roman" w:cs="Times New Roman"/>
         </w:rPr>
+        <w:jc w:val="left"/>
       </w:pPr>
       <w:bookmarkStart w:id="1" w:name="identitas-artikel"/>
       <w:r>
@@ -145,6 +152,7 @@
         <w:rPr>
           <w:rFonts w:cs="Times New Roman"/>
         </w:rPr>
+        <w:jc w:val="both"/>
       </w:pPr>
       <w:r>
         <w:rPr>
@@ -176,6 +184,7 @@
         <w:rPr>
           <w:rFonts w:cs="Times New Roman"/>
         </w:rPr>
+        <w:jc w:val="both"/>
       </w:pPr>
       <w:r>
         <w:rPr>
@@ -199,6 +208,7 @@
         <w:rPr>
           <w:rFonts w:cs="Times New Roman"/>
         </w:rPr>
+        <w:jc w:val="both"/>
       </w:pPr>
       <w:r>
         <w:rPr>
@@ -222,6 +232,7 @@
         <w:rPr>
           <w:rFonts w:cs="Times New Roman"/>
         </w:rPr>
+        <w:jc w:val="both"/>
       </w:pPr>
       <w:r>
         <w:rPr>
@@ -259,6 +270,7 @@
         <w:rPr>
           <w:rFonts w:cs="Times New Roman"/>
         </w:rPr>
+        <w:jc w:val="both"/>
       </w:pPr>
       <w:r>
         <w:rPr>
@@ -282,6 +294,7 @@
         <w:rPr>
           <w:rFonts w:cs="Times New Roman"/>
         </w:rPr>
+        <w:jc w:val="both"/>
       </w:pPr>
       <w:r>
         <w:rPr>
@@ -305,6 +318,7 @@
           <w:rFonts w:ascii="Times New Roman" w:hAnsi="Times New Roman" w:cs="Times New Roman"/>
           <w:lang w:val="da-DK"/>
         </w:rPr>
+        <w:jc w:val="left"/>
       </w:pPr>
       <w:bookmarkStart w:id="2" w:name="X9ca7e4db898c0454268789f9a8be7181fc9df28"/>
       <w:bookmarkEnd w:id="1"/>
@@ -322,6 +336,7 @@
           <w:rFonts w:cs="Times New Roman"/>
           <w:lang w:val="da-DK"/>
         </w:rPr>
+        <w:jc w:val="both"/>
       </w:pPr>
       <w:r>
         <w:rPr>
@@ -354,6 +369,7 @@
           <w:rFonts w:cs="Times New Roman"/>
           <w:lang w:val="da-DK"/>
         </w:rPr>
+        <w:jc w:val="both"/>
       </w:pPr>
       <w:r>
         <w:rPr>
@@ -394,6 +410,7 @@
           <w:rFonts w:cs="Times New Roman"/>
           <w:lang w:val="da-DK"/>
         </w:rPr>
+        <w:jc w:val="both"/>
       </w:pPr>
       <w:r>
         <w:rPr>
@@ -442,6 +459,7 @@
           <w:rFonts w:ascii="Times New Roman" w:hAnsi="Times New Roman" w:cs="Times New Roman"/>
           <w:lang w:val="da-DK"/>
         </w:rPr>
+        <w:jc w:val="left"/>
       </w:pPr>
       <w:bookmarkStart w:id="3" w:name="Xcf08b1a14eda0371882da8af5ec2249acf05a98"/>
       <w:bookmarkEnd w:id="2"/>
@@ -459,6 +477,7 @@
           <w:rFonts w:cs="Times New Roman"/>
           <w:lang w:val="da-DK"/>
         </w:rPr>
+        <w:jc w:val="both"/>
       </w:pPr>
       <w:r>
         <w:rPr>
@@ -490,6 +509,7 @@
         <w:rPr>
           <w:rFonts w:cs="Times New Roman"/>
         </w:rPr>
+        <w:jc w:val="both"/>
       </w:pPr>
       <w:r>
         <w:rPr>
@@ -619,6 +639,7 @@
         <w:rPr>
           <w:rFonts w:cs="Times New Roman"/>
         </w:rPr>
+        <w:jc w:val="both"/>
       </w:pPr>
       <w:r>
         <w:rPr>
@@ -647,6 +668,7 @@
         <w:rPr>
           <w:rFonts w:cs="Times New Roman"/>
         </w:rPr>
+        <w:jc w:val="both"/>
       </w:pPr>
       <w:r>
         <w:rPr>
@@ -675,6 +697,7 @@
         <w:rPr>
           <w:rFonts w:cs="Times New Roman"/>
         </w:rPr>
+        <w:jc w:val="both"/>
       </w:pPr>
       <w:r>
         <w:rPr>
@@ -703,6 +726,7 @@
         <w:rPr>
           <w:rFonts w:cs="Times New Roman"/>
         </w:rPr>
+        <w:jc w:val="both"/>
       </w:pPr>
       <w:r>
         <w:rPr>
@@ -732,6 +756,7 @@
         <w:rPr>
           <w:rFonts w:cs="Times New Roman"/>
         </w:rPr>
+        <w:jc w:val="both"/>
       </w:pPr>
       <w:r>
         <w:rPr>
@@ -761,6 +786,7 @@
           <w:rFonts w:ascii="Times New Roman" w:hAnsi="Times New Roman" w:cs="Times New Roman"/>
           <w:lang w:val="fi-FI"/>
         </w:rPr>
+        <w:jc w:val="left"/>
       </w:pPr>
       <w:bookmarkStart w:id="4" w:name="X0db685f7af3930fa235b792d63a9d512e01f189"/>
       <w:bookmarkEnd w:id="3"/>
@@ -778,6 +804,7 @@
           <w:rFonts w:cs="Times New Roman"/>
           <w:lang w:val="da-DK"/>
         </w:rPr>
+        <w:jc w:val="both"/>
       </w:pPr>
       <w:r>
         <w:rPr>
@@ -826,6 +853,7 @@
           <w:rFonts w:cs="Times New Roman"/>
           <w:lang w:val="da-DK"/>
         </w:rPr>
+        <w:jc w:val="both"/>
       </w:pPr>
       <w:r>
         <w:rPr>
@@ -841,6 +869,7 @@
         <w:rPr>
           <w:rFonts w:cs="Times New Roman"/>
         </w:rPr>
+        <w:jc w:val="both"/>
       </w:pPr>
       <w:r>
         <w:rPr>
@@ -960,6 +989,7 @@
         <w:rPr>
           <w:rFonts w:ascii="Times New Roman" w:hAnsi="Times New Roman" w:cs="Times New Roman"/>
         </w:rPr>
+        <w:jc w:val="left"/>
       </w:pPr>
       <w:bookmarkStart w:id="5" w:name="kekuatan-artikel"/>
       <w:bookmarkEnd w:id="4"/>
@@ -975,6 +1005,7 @@
         <w:rPr>
           <w:rFonts w:cs="Times New Roman"/>
         </w:rPr>
+        <w:jc w:val="both"/>
       </w:pPr>
       <w:r>
         <w:rPr>
@@ -1055,6 +1086,7 @@
           <w:rFonts w:cs="Times New Roman"/>
           <w:lang w:val="fi-FI"/>
         </w:rPr>
+        <w:jc w:val="both"/>
       </w:pPr>
       <w:r>
         <w:rPr>
@@ -1087,6 +1119,7 @@
           <w:rFonts w:cs="Times New Roman"/>
           <w:lang w:val="fi-FI"/>
         </w:rPr>
+        <w:jc w:val="both"/>
       </w:pPr>
       <w:r>
         <w:rPr>
@@ -1119,6 +1152,7 @@
           <w:rFonts w:cs="Times New Roman"/>
           <w:lang w:val="fi-FI"/>
         </w:rPr>
+        <w:jc w:val="both"/>
       </w:pPr>
       <w:r>
         <w:rPr>
@@ -1167,6 +1201,7 @@
           <w:rFonts w:ascii="Times New Roman" w:hAnsi="Times New Roman" w:cs="Times New Roman"/>
           <w:lang w:val="fi-FI"/>
         </w:rPr>
+        <w:jc w:val="left"/>
       </w:pPr>
       <w:bookmarkStart w:id="6" w:name="keterbatasan-dan-kelemahan"/>
       <w:bookmarkEnd w:id="5"/>
@@ -1184,6 +1219,7 @@
           <w:rFonts w:cs="Times New Roman"/>
           <w:lang w:val="da-DK"/>
         </w:rPr>
+        <w:jc w:val="both"/>
       </w:pPr>
       <w:r>
         <w:rPr>
@@ -1264,6 +1300,7 @@
           <w:rFonts w:cs="Times New Roman"/>
           <w:lang w:val="da-DK"/>
         </w:rPr>
+        <w:jc w:val="both"/>
       </w:pPr>
       <w:r>
         <w:rPr>
@@ -1329,6 +1366,7 @@
           <w:rFonts w:cs="Times New Roman"/>
           <w:lang w:val="da-DK"/>
         </w:rPr>
+        <w:jc w:val="both"/>
       </w:pPr>
       <w:r>
         <w:rPr>
@@ -1386,6 +1424,7 @@
           <w:rFonts w:cs="Times New Roman"/>
           <w:lang w:val="fi-FI"/>
         </w:rPr>
+        <w:jc w:val="both"/>
       </w:pPr>
       <w:r>
         <w:rPr>
@@ -1491,6 +1530,7 @@
           <w:rFonts w:cs="Times New Roman"/>
           <w:lang w:val="da-DK"/>
         </w:rPr>
+        <w:jc w:val="both"/>
       </w:pPr>
       <w:r>
         <w:rPr>
@@ -1523,6 +1563,7 @@
           <w:rFonts w:ascii="Times New Roman" w:hAnsi="Times New Roman" w:cs="Times New Roman"/>
           <w:lang w:val="da-DK"/>
         </w:rPr>
+        <w:jc w:val="left"/>
       </w:pPr>
       <w:bookmarkStart w:id="7" w:name="evaluasi-kritis"/>
       <w:bookmarkEnd w:id="6"/>
@@ -1540,6 +1581,7 @@
           <w:rFonts w:cs="Times New Roman"/>
           <w:lang w:val="da-DK"/>
         </w:rPr>
+        <w:jc w:val="both"/>
       </w:pPr>
       <w:r>
         <w:rPr>
@@ -1588,6 +1630,7 @@
           <w:rFonts w:cs="Times New Roman"/>
           <w:lang w:val="fi-FI"/>
         </w:rPr>
+        <w:jc w:val="both"/>
       </w:pPr>
       <w:r>
         <w:rPr>
@@ -1644,6 +1687,7 @@
           <w:rFonts w:cs="Times New Roman"/>
           <w:lang w:val="fi-FI"/>
         </w:rPr>
+        <w:jc w:val="both"/>
       </w:pPr>
       <w:r>
         <w:rPr>
@@ -1685,6 +1729,7 @@
           <w:rFonts w:cs="Times New Roman"/>
           <w:lang w:val="fi-FI"/>
         </w:rPr>
+        <w:jc w:val="both"/>
       </w:pPr>
       <w:r>
         <w:rPr>
@@ -1742,6 +1787,7 @@
           <w:rFonts w:cs="Times New Roman"/>
           <w:lang w:val="fi-FI"/>
         </w:rPr>
+        <w:jc w:val="both"/>
       </w:pPr>
       <w:r>
         <w:rPr>
@@ -1822,6 +1868,7 @@
           <w:rFonts w:ascii="Times New Roman" w:hAnsi="Times New Roman" w:cs="Times New Roman"/>
           <w:lang w:val="fi-FI"/>
         </w:rPr>
+        <w:jc w:val="left"/>
       </w:pPr>
       <w:bookmarkStart w:id="8" w:name="X08ce25e3f5d53481848f16121df5d913eaf4e5d"/>
       <w:bookmarkEnd w:id="7"/>
@@ -1839,6 +1886,7 @@
           <w:rFonts w:cs="Times New Roman"/>
           <w:lang w:val="fi-FI"/>
         </w:rPr>
+        <w:jc w:val="both"/>
       </w:pPr>
       <w:r>
         <w:rPr>
@@ -1864,6 +1912,7 @@
           <w:rFonts w:cs="Times New Roman"/>
           <w:lang w:val="fi-FI"/>
         </w:rPr>
+        <w:jc w:val="both"/>
       </w:pPr>
       <w:r>
         <w:rPr>
@@ -1947,6 +1996,7 @@
           <w:rFonts w:cs="Times New Roman"/>
           <w:lang w:val="fi-FI"/>
         </w:rPr>
+        <w:jc w:val="both"/>
       </w:pPr>
       <w:r>
         <w:rPr>
@@ -2036,6 +2086,7 @@
           <w:rFonts w:cs="Times New Roman"/>
           <w:lang w:val="fi-FI"/>
         </w:rPr>
+        <w:jc w:val="both"/>
       </w:pPr>
       <w:r>
         <w:rPr>
@@ -2077,6 +2128,7 @@
           <w:rFonts w:ascii="Times New Roman" w:hAnsi="Times New Roman" w:cs="Times New Roman"/>
           <w:lang w:val="da-DK"/>
         </w:rPr>
+        <w:jc w:val="left"/>
       </w:pPr>
       <w:bookmarkStart w:id="9" w:name="X9715f5477454b0f18f77c34a9fa9ac7a18408da"/>
       <w:bookmarkEnd w:id="8"/>
@@ -2094,6 +2146,7 @@
           <w:rFonts w:cs="Times New Roman"/>
           <w:lang w:val="da-DK"/>
         </w:rPr>
+        <w:jc w:val="both"/>
       </w:pPr>
       <w:r>
         <w:rPr>
@@ -2119,6 +2172,7 @@
           <w:rFonts w:cs="Times New Roman"/>
           <w:lang w:val="da-DK"/>
         </w:rPr>
+        <w:jc w:val="both"/>
       </w:pPr>
       <w:r>
         <w:rPr>
@@ -2160,6 +2214,7 @@
           <w:rFonts w:cs="Times New Roman"/>
           <w:lang w:val="da-DK"/>
         </w:rPr>
+        <w:jc w:val="both"/>
       </w:pPr>
       <w:r>
         <w:rPr>
@@ -2197,8 +2252,8 @@
       <w:bookmarkEnd w:id="9"/>
     </w:p>
     <w:sectPr>
-      <w:pgSz w:w="12240" w:h="15840"/>
-      <w:pgMar w:top="1701" w:right="1417" w:bottom="1417" w:left="1701" w:header="720" w:footer="720" w:gutter="0"/>
+      <w:pgSz w:w="11906" w:h="16838"/>
+      <w:pgMar w:top="1701" w:right="1701" w:bottom="1701" w:left="2268" w:header="720" w:footer="720" w:gutter="0"/>
       <w:cols w:space="720"/>
       <w:docGrid w:linePitch="360"/>
     </w:sectPr>

</xml_diff>